<commit_message>
RQM Complemento Logs - E4: Uso en artículos con LIKE, complementos y referencias de 2 dígitos
- FN_INTERNAL_REFERENCE_USED_CONSECUTIVES (script 20): INTERNAL_REFERENCE LIKE 'CÓDIGO-%' con el código
  escapado; toma el bloque de 2 o 3 dígitos después del guion, terminado o seguido de '-' y complemento
  (MU-001, MU-001-1, MU-001-02, MU-001-X = 1; MU-25 = 025). Comparación por valor numérico para la
  depuración de usados y el cálculo del mayor.
- Plan de trabajo, manuales y casos de prueba E4 actualizados.

Co-Authored-By: Claude Opus 5.5 <noreply@anthropic.com>
Claude-Session: https://claude.ai/code/session_01BJBf3VznR328nVdwrkfCSa
</commit_message>
<xml_diff>
--- a/documentos/2026-10-20 RQM Complemento de Modúlo de consulta de logs/T17 - Manual de Usuario.docx
+++ b/documentos/2026-10-20 RQM Complemento de Modúlo de consulta de logs/T17 - Manual de Usuario.docx
@@ -4389,7 +4389,97 @@
           <w:sz w:val="20"/>
           <w:szCs w:val="20"/>
         </w:rPr>
-        <w:t xml:space="preserve"> del código. Cuando un consecutivo se usa como referencia interna de un artículo, el sistema lo elimina de los disponibles.</w:t>
+        <w:t xml:space="preserve"> del código. Cuando un consecutivo se usa como referencia interna de un artículo, el sistema lo elimina de los disponibles. Se considera usado aunque el artículo tenga un complemento: </w:t>
+      </w:r>
+      <w:r>
+        <w:rPr>
+          <w:rFonts w:ascii="Century Gothic" w:cs="Century Gothic" w:eastAsia="Century Gothic" w:hAnsi="Century Gothic"/>
+          <w:b/>
+          <w:bCs/>
+          <w:sz w:val="20"/>
+          <w:szCs w:val="20"/>
+        </w:rPr>
+        <w:t xml:space="preserve">MU-026</w:t>
+      </w:r>
+      <w:r>
+        <w:rPr>
+          <w:rFonts w:ascii="Century Gothic" w:cs="Century Gothic" w:eastAsia="Century Gothic" w:hAnsi="Century Gothic"/>
+          <w:sz w:val="20"/>
+          <w:szCs w:val="20"/>
+        </w:rPr>
+        <w:t xml:space="preserve">, </w:t>
+      </w:r>
+      <w:r>
+        <w:rPr>
+          <w:rFonts w:ascii="Century Gothic" w:cs="Century Gothic" w:eastAsia="Century Gothic" w:hAnsi="Century Gothic"/>
+          <w:b/>
+          <w:bCs/>
+          <w:sz w:val="20"/>
+          <w:szCs w:val="20"/>
+        </w:rPr>
+        <w:t xml:space="preserve">MU-026-1</w:t>
+      </w:r>
+      <w:r>
+        <w:rPr>
+          <w:rFonts w:ascii="Century Gothic" w:cs="Century Gothic" w:eastAsia="Century Gothic" w:hAnsi="Century Gothic"/>
+          <w:sz w:val="20"/>
+          <w:szCs w:val="20"/>
+        </w:rPr>
+        <w:t xml:space="preserve">, </w:t>
+      </w:r>
+      <w:r>
+        <w:rPr>
+          <w:rFonts w:ascii="Century Gothic" w:cs="Century Gothic" w:eastAsia="Century Gothic" w:hAnsi="Century Gothic"/>
+          <w:b/>
+          <w:bCs/>
+          <w:sz w:val="20"/>
+          <w:szCs w:val="20"/>
+        </w:rPr>
+        <w:t xml:space="preserve">MU-026-02</w:t>
+      </w:r>
+      <w:r>
+        <w:rPr>
+          <w:rFonts w:ascii="Century Gothic" w:cs="Century Gothic" w:eastAsia="Century Gothic" w:hAnsi="Century Gothic"/>
+          <w:sz w:val="20"/>
+          <w:szCs w:val="20"/>
+        </w:rPr>
+        <w:t xml:space="preserve"> o </w:t>
+      </w:r>
+      <w:r>
+        <w:rPr>
+          <w:rFonts w:ascii="Century Gothic" w:cs="Century Gothic" w:eastAsia="Century Gothic" w:hAnsi="Century Gothic"/>
+          <w:b/>
+          <w:bCs/>
+          <w:sz w:val="20"/>
+          <w:szCs w:val="20"/>
+        </w:rPr>
+        <w:t xml:space="preserve">MU-026-X</w:t>
+      </w:r>
+      <w:r>
+        <w:rPr>
+          <w:rFonts w:ascii="Century Gothic" w:cs="Century Gothic" w:eastAsia="Century Gothic" w:hAnsi="Century Gothic"/>
+          <w:sz w:val="20"/>
+          <w:szCs w:val="20"/>
+        </w:rPr>
+        <w:t xml:space="preserve"> usan el consecutivo 026. Las referencias existentes de 2 dígitos (por ejemplo </w:t>
+      </w:r>
+      <w:r>
+        <w:rPr>
+          <w:rFonts w:ascii="Century Gothic" w:cs="Century Gothic" w:eastAsia="Century Gothic" w:hAnsi="Century Gothic"/>
+          <w:b/>
+          <w:bCs/>
+          <w:sz w:val="20"/>
+          <w:szCs w:val="20"/>
+        </w:rPr>
+        <w:t xml:space="preserve">MU-25</w:t>
+      </w:r>
+      <w:r>
+        <w:rPr>
+          <w:rFonts w:ascii="Century Gothic" w:cs="Century Gothic" w:eastAsia="Century Gothic" w:hAnsi="Century Gothic"/>
+          <w:sz w:val="20"/>
+          <w:szCs w:val="20"/>
+        </w:rPr>
+        <w:t xml:space="preserve">) se toman como 025.</w:t>
       </w:r>
     </w:p>
     <w:p>

</xml_diff>

<commit_message>
RQM Complemento Logs - E4: manuales y casos de prueba con regla de 1 a 3 dígitos y referencias que no cumplen
Co-Authored-By: Claude Opus 5.5 <noreply@anthropic.com>
Claude-Session: https://claude.ai/code/session_01BJBf3VznR328nVdwrkfCSa
</commit_message>
<xml_diff>
--- a/documentos/2026-10-20 RQM Complemento de Modúlo de consulta de logs/T17 - Manual de Usuario.docx
+++ b/documentos/2026-10-20 RQM Complemento de Modúlo de consulta de logs/T17 - Manual de Usuario.docx
@@ -4461,7 +4461,7 @@
           <w:sz w:val="20"/>
           <w:szCs w:val="20"/>
         </w:rPr>
-        <w:t xml:space="preserve"> usan el consecutivo 026. Las referencias existentes de 2 dígitos (por ejemplo </w:t>
+        <w:t xml:space="preserve"> usan el consecutivo 026. Las referencias existentes de 1 o 2 dígitos se completan a 3 (</w:t>
       </w:r>
       <w:r>
         <w:rPr>
@@ -4479,7 +4479,92 @@
           <w:sz w:val="20"/>
           <w:szCs w:val="20"/>
         </w:rPr>
-        <w:t xml:space="preserve">) se toman como 025.</w:t>
+        <w:t xml:space="preserve"> = 025, </w:t>
+      </w:r>
+      <w:r>
+        <w:rPr>
+          <w:rFonts w:ascii="Century Gothic" w:cs="Century Gothic" w:eastAsia="Century Gothic" w:hAnsi="Century Gothic"/>
+          <w:b/>
+          <w:bCs/>
+          <w:sz w:val="20"/>
+          <w:szCs w:val="20"/>
+        </w:rPr>
+        <w:t xml:space="preserve">MU-5</w:t>
+      </w:r>
+      <w:r>
+        <w:rPr>
+          <w:rFonts w:ascii="Century Gothic" w:cs="Century Gothic" w:eastAsia="Century Gothic" w:hAnsi="Century Gothic"/>
+          <w:sz w:val="20"/>
+          <w:szCs w:val="20"/>
+        </w:rPr>
+        <w:t xml:space="preserve"> = 005).</w:t>
+      </w:r>
+    </w:p>
+    <w:p>
+      <w:pPr>
+        <w:spacing w:after="120" w:line="276"/>
+      </w:pPr>
+      <w:r>
+        <w:rPr>
+          <w:rFonts w:ascii="Century Gothic" w:cs="Century Gothic" w:eastAsia="Century Gothic" w:hAnsi="Century Gothic"/>
+          <w:sz w:val="20"/>
+          <w:szCs w:val="20"/>
+        </w:rPr>
+        <w:t xml:space="preserve">Si el código tiene referencias que no cumplen ese formato (por ejemplo </w:t>
+      </w:r>
+      <w:r>
+        <w:rPr>
+          <w:rFonts w:ascii="Century Gothic" w:cs="Century Gothic" w:eastAsia="Century Gothic" w:hAnsi="Century Gothic"/>
+          <w:b/>
+          <w:bCs/>
+          <w:sz w:val="20"/>
+          <w:szCs w:val="20"/>
+        </w:rPr>
+        <w:t xml:space="preserve">MU-25X</w:t>
+      </w:r>
+      <w:r>
+        <w:rPr>
+          <w:rFonts w:ascii="Century Gothic" w:cs="Century Gothic" w:eastAsia="Century Gothic" w:hAnsi="Century Gothic"/>
+          <w:sz w:val="20"/>
+          <w:szCs w:val="20"/>
+        </w:rPr>
+        <w:t xml:space="preserve"> o </w:t>
+      </w:r>
+      <w:r>
+        <w:rPr>
+          <w:rFonts w:ascii="Century Gothic" w:cs="Century Gothic" w:eastAsia="Century Gothic" w:hAnsi="Century Gothic"/>
+          <w:b/>
+          <w:bCs/>
+          <w:sz w:val="20"/>
+          <w:szCs w:val="20"/>
+        </w:rPr>
+        <w:t xml:space="preserve">MU-ABC</w:t>
+      </w:r>
+      <w:r>
+        <w:rPr>
+          <w:rFonts w:ascii="Century Gothic" w:cs="Century Gothic" w:eastAsia="Century Gothic" w:hAnsi="Century Gothic"/>
+          <w:sz w:val="20"/>
+          <w:szCs w:val="20"/>
+        </w:rPr>
+        <w:t xml:space="preserve">), la pantalla las muestra en una lista aparte con el </w:t>
+      </w:r>
+      <w:r>
+        <w:rPr>
+          <w:rFonts w:ascii="Century Gothic" w:cs="Century Gothic" w:eastAsia="Century Gothic" w:hAnsi="Century Gothic"/>
+          <w:b/>
+          <w:bCs/>
+          <w:sz w:val="20"/>
+          <w:szCs w:val="20"/>
+        </w:rPr>
+        <w:t xml:space="preserve">motivo</w:t>
+      </w:r>
+      <w:r>
+        <w:rPr>
+          <w:rFonts w:ascii="Century Gothic" w:cs="Century Gothic" w:eastAsia="Century Gothic" w:hAnsi="Century Gothic"/>
+          <w:sz w:val="20"/>
+          <w:szCs w:val="20"/>
+        </w:rPr>
+        <w:t xml:space="preserve">: no cuentan para calcular el siguiente consecutivo. Por eso, por ejemplo, el siguiente puede ser 001 aunque exista MU-25X.</w:t>
       </w:r>
     </w:p>
     <w:p>

</xml_diff>